<commit_message>
Enhance report diagrams for version 2
</commit_message>
<xml_diff>
--- a/deliverables/exports/article-draft-v2.docx
+++ b/deliverables/exports/article-draft-v2.docx
@@ -130,7 +130,7 @@
       <w:r>
         <w:drawing>
           <wp:inline>
-            <wp:extent cx="5334000" cy="1530803"/>
+            <wp:extent cx="5334000" cy="2109107"/>
             <wp:effectExtent b="0" l="0" r="0" t="0"/>
             <wp:docPr descr="Conceptual framework diagram" title="" id="13" name="Picture"/>
             <a:graphic>
@@ -151,7 +151,7 @@
                   <pic:spPr bwMode="auto">
                     <a:xfrm>
                       <a:off x="0" y="0"/>
-                      <a:ext cx="5334000" cy="1530803"/>
+                      <a:ext cx="5334000" cy="2109107"/>
                     </a:xfrm>
                     <a:prstGeom prst="rect">
                       <a:avLst/>
@@ -408,7 +408,7 @@
       <w:r>
         <w:drawing>
           <wp:inline>
-            <wp:extent cx="5334000" cy="6343618"/>
+            <wp:extent cx="5334000" cy="5919107"/>
             <wp:effectExtent b="0" l="0" r="0" t="0"/>
             <wp:docPr descr="Study workflow diagram" title="" id="20" name="Picture"/>
             <a:graphic>
@@ -429,7 +429,7 @@
                   <pic:spPr bwMode="auto">
                     <a:xfrm>
                       <a:off x="0" y="0"/>
-                      <a:ext cx="5334000" cy="6343618"/>
+                      <a:ext cx="5334000" cy="5919107"/>
                     </a:xfrm>
                     <a:prstGeom prst="rect">
                       <a:avLst/>
@@ -1175,7 +1175,7 @@
       <w:r>
         <w:drawing>
           <wp:inline>
-            <wp:extent cx="5334000" cy="2850696"/>
+            <wp:extent cx="5334000" cy="3374571"/>
             <wp:effectExtent b="0" l="0" r="0" t="0"/>
             <wp:docPr descr="Results synthesis diagram" title="" id="35" name="Picture"/>
             <a:graphic>
@@ -1196,7 +1196,7 @@
                   <pic:spPr bwMode="auto">
                     <a:xfrm>
                       <a:off x="0" y="0"/>
-                      <a:ext cx="5334000" cy="2850696"/>
+                      <a:ext cx="5334000" cy="3374571"/>
                     </a:xfrm>
                     <a:prstGeom prst="rect">
                       <a:avLst/>

</xml_diff>

<commit_message>
Revert version 2 diagram enhancement
</commit_message>
<xml_diff>
--- a/deliverables/exports/article-draft-v2.docx
+++ b/deliverables/exports/article-draft-v2.docx
@@ -130,7 +130,7 @@
       <w:r>
         <w:drawing>
           <wp:inline>
-            <wp:extent cx="5334000" cy="2109107"/>
+            <wp:extent cx="5334000" cy="1530803"/>
             <wp:effectExtent b="0" l="0" r="0" t="0"/>
             <wp:docPr descr="Conceptual framework diagram" title="" id="13" name="Picture"/>
             <a:graphic>
@@ -151,7 +151,7 @@
                   <pic:spPr bwMode="auto">
                     <a:xfrm>
                       <a:off x="0" y="0"/>
-                      <a:ext cx="5334000" cy="2109107"/>
+                      <a:ext cx="5334000" cy="1530803"/>
                     </a:xfrm>
                     <a:prstGeom prst="rect">
                       <a:avLst/>
@@ -408,7 +408,7 @@
       <w:r>
         <w:drawing>
           <wp:inline>
-            <wp:extent cx="5334000" cy="5919107"/>
+            <wp:extent cx="5334000" cy="6343618"/>
             <wp:effectExtent b="0" l="0" r="0" t="0"/>
             <wp:docPr descr="Study workflow diagram" title="" id="20" name="Picture"/>
             <a:graphic>
@@ -429,7 +429,7 @@
                   <pic:spPr bwMode="auto">
                     <a:xfrm>
                       <a:off x="0" y="0"/>
-                      <a:ext cx="5334000" cy="5919107"/>
+                      <a:ext cx="5334000" cy="6343618"/>
                     </a:xfrm>
                     <a:prstGeom prst="rect">
                       <a:avLst/>
@@ -1175,7 +1175,7 @@
       <w:r>
         <w:drawing>
           <wp:inline>
-            <wp:extent cx="5334000" cy="3374571"/>
+            <wp:extent cx="5334000" cy="2850696"/>
             <wp:effectExtent b="0" l="0" r="0" t="0"/>
             <wp:docPr descr="Results synthesis diagram" title="" id="35" name="Picture"/>
             <a:graphic>
@@ -1196,7 +1196,7 @@
                   <pic:spPr bwMode="auto">
                     <a:xfrm>
                       <a:off x="0" y="0"/>
-                      <a:ext cx="5334000" cy="3374571"/>
+                      <a:ext cx="5334000" cy="2850696"/>
                     </a:xfrm>
                     <a:prstGeom prst="rect">
                       <a:avLst/>

</xml_diff>